<commit_message>
feat: gate training with thermal and GPU resource policy
</commit_message>
<xml_diff>
--- a/sop-platform/docs/32_宁波视觉SOP_CVAT分布式预标注完整说明书_20260823.docx
+++ b/sop-platform/docs/32_宁波视觉SOP_CVAT分布式预标注完整说明书_20260823.docx
@@ -4430,6 +4430,138 @@
           <w:sz w:val="24"/>
         </w:rPr>
         <w:t xml:space="preserve"> 的 344 帧执行完整预标。验收必须确认：AI 数据库记录 344 个帧状态；标注 ID 含视频 ID，不与其他视频冲突；标签不含本轮排除的微小元件；所有候选均待人工复核；框单击选择延迟目标低于 50 ms；GPU 未触发 70°C 停机线；人工标注库未因 AI 结果明显膨胀。通过后才能逐步开放其余视频和第二节点。</w:t>
+      </w:r>
+    </w:p>
+    <w:p>
+      <w:pPr>
+        <w:pStyle w:val="Heading2"/>
+      </w:pPr>
+      <w:r>
+        <w:rPr>
+          <w:rFonts w:ascii="Times New Roman" w:hAnsi="Times New Roman" w:eastAsia="KaiTi"/>
+          <w:b w:val="0"/>
+          <w:sz w:val="30"/>
+        </w:rPr>
+        <w:t>24.6 训练资源调度和 DDP 边界</w:t>
+      </w:r>
+    </w:p>
+    <w:p>
+      <w:pPr>
+        <w:spacing w:line="360" w:lineRule="auto" w:after="120"/>
+      </w:pPr>
+      <w:r>
+        <w:rPr>
+          <w:rFonts w:ascii="Times New Roman" w:hAnsi="Times New Roman" w:eastAsia="KaiTi"/>
+          <w:b w:val="0"/>
+          <w:sz w:val="24"/>
+        </w:rPr>
+        <w:t xml:space="preserve">06 训练执行器会读取本机 </w:t>
+      </w:r>
+      <w:r>
+        <w:rPr>
+          <w:rFonts w:ascii="Times New Roman" w:hAnsi="Times New Roman" w:eastAsia="KaiTi"/>
+          <w:b/>
+          <w:sz w:val="24"/>
+        </w:rPr>
+        <w:t>nvidia-smi -L</w:t>
+      </w:r>
+      <w:r>
+        <w:rPr>
+          <w:rFonts w:ascii="Times New Roman" w:hAnsi="Times New Roman" w:eastAsia="KaiTi"/>
+          <w:b w:val="0"/>
+          <w:sz w:val="24"/>
+        </w:rPr>
+        <w:t xml:space="preserve"> 的真实 GPU 数量。只有同一训练节点实际存在两块或更多 GPU 时，设备列表 </w:t>
+      </w:r>
+      <w:r>
+        <w:rPr>
+          <w:rFonts w:ascii="Times New Roman" w:hAnsi="Times New Roman" w:eastAsia="KaiTi"/>
+          <w:b/>
+          <w:sz w:val="24"/>
+        </w:rPr>
+        <w:t>0,1</w:t>
+      </w:r>
+      <w:r>
+        <w:rPr>
+          <w:rFonts w:ascii="Times New Roman" w:hAnsi="Times New Roman" w:eastAsia="KaiTi"/>
+          <w:b w:val="0"/>
+          <w:sz w:val="24"/>
+        </w:rPr>
+        <w:t xml:space="preserve"> 才具备 Ultralytics/PyTorch DDP 条件；当前 DGX Spark 只检测到一块 NVIDIA GB10，因此只能使用 GPU 0，不能把多个进程启动在同一块卡上冒充分布式训练。</w:t>
+      </w:r>
+    </w:p>
+    <w:p>
+      <w:pPr>
+        <w:spacing w:line="360" w:lineRule="auto" w:after="120"/>
+      </w:pPr>
+      <w:r>
+        <w:rPr>
+          <w:rFonts w:ascii="Times New Roman" w:hAnsi="Times New Roman" w:eastAsia="KaiTi"/>
+          <w:b w:val="0"/>
+          <w:sz w:val="24"/>
+        </w:rPr>
+        <w:t xml:space="preserve">GPU 训练与分布式预标互斥：若 03 页面仍有 worker 正在运行，训练 API 会拒绝启动并提示先暂停预标。系统同一时间只允许一个真实训练任务。训练默认 </w:t>
+      </w:r>
+      <w:r>
+        <w:rPr>
+          <w:rFonts w:ascii="Times New Roman" w:hAnsi="Times New Roman" w:eastAsia="KaiTi"/>
+          <w:b/>
+          <w:sz w:val="24"/>
+        </w:rPr>
+        <w:t>batch=4</w:t>
+      </w:r>
+      <w:r>
+        <w:rPr>
+          <w:rFonts w:ascii="Times New Roman" w:hAnsi="Times New Roman" w:eastAsia="KaiTi"/>
+          <w:b w:val="0"/>
+          <w:sz w:val="24"/>
+        </w:rPr>
+        <w:t>、</w:t>
+      </w:r>
+      <w:r>
+        <w:rPr>
+          <w:rFonts w:ascii="Times New Roman" w:hAnsi="Times New Roman" w:eastAsia="KaiTi"/>
+          <w:b/>
+          <w:sz w:val="24"/>
+        </w:rPr>
+        <w:t>imgsz=640</w:t>
+      </w:r>
+      <w:r>
+        <w:rPr>
+          <w:rFonts w:ascii="Times New Roman" w:hAnsi="Times New Roman" w:eastAsia="KaiTi"/>
+          <w:b w:val="0"/>
+          <w:sz w:val="24"/>
+        </w:rPr>
+        <w:t>、DataLoader worker 1、低 CPU/I/O 调度；每个训练和验证 batch 前检查温度，达到 70°C 暂停、降到 62°C 恢复。现场实时检测仍具有最高业务优先级，训练应安排在人工复核和数据冻结完成后的夜间窗口。</w:t>
+      </w:r>
+    </w:p>
+    <w:p>
+      <w:pPr>
+        <w:spacing w:line="360" w:lineRule="auto" w:after="120"/>
+      </w:pPr>
+      <w:r>
+        <w:rPr>
+          <w:rFonts w:ascii="Times New Roman" w:hAnsi="Times New Roman" w:eastAsia="KaiTi"/>
+          <w:b w:val="0"/>
+          <w:sz w:val="24"/>
+        </w:rPr>
+        <w:t xml:space="preserve">跨主机 DDP 只有在远端节点通过 GPU、CUDA、网络、共享数据、模型 SHA256 和 NCCL 验收后才能启用。当前 </w:t>
+      </w:r>
+      <w:r>
+        <w:rPr>
+          <w:rFonts w:ascii="Times New Roman" w:hAnsi="Times New Roman" w:eastAsia="KaiTi"/>
+          <w:b/>
+          <w:sz w:val="24"/>
+        </w:rPr>
+        <w:t>.128</w:t>
+      </w:r>
+      <w:r>
+        <w:rPr>
+          <w:rFonts w:ascii="Times New Roman" w:hAnsi="Times New Roman" w:eastAsia="KaiTi"/>
+          <w:b w:val="0"/>
+          <w:sz w:val="24"/>
+        </w:rPr>
+        <w:t xml:space="preserve"> 仅确认 SSH 端口可达，尚未完成免密密钥和 GPU 能力检查，所以不能登记为训练节点，也不能宣称已经使用两台机器共同训练。</w:t>
       </w:r>
     </w:p>
     <w:p>

</xml_diff>